<commit_message>
Fix Volumes Monthly: use [RACI Sharepoint] placeholder with month-by-month bullet-point LLM output
Co-authored-by: livesid44 <169084330+livesid44@users.noreply.github.com>
</commit_message>
<xml_diff>
--- a/src/IQFlowAgent.Web/wwwroot/templates/BARTOK_S8_SOP_Template_v2.docx
+++ b/src/IQFlowAgent.Web/wwwroot/templates/BARTOK_S8_SOP_Template_v2.docx
@@ -3872,720 +3872,10 @@
             </w:tcMar>
           </w:tcPr>
           <w:p>
-            <w:pPr>
-              <w:spacing w:after="60"/>
-            </w:pPr>
-            <w:r>
-              <w:rPr>
-                <w:rFonts w:ascii="Aptos" w:eastAsia="Aptos" w:hAnsi="Aptos" w:cs="Aptos"/>
-                <w:i/>
-                <w:iCs/>
-                <w:color w:val="777777"/>
-                <w:sz w:val="18"/>
-                <w:szCs w:val="18"/>
-              </w:rPr>
-              <w:t>Enter actual transaction volume for each of the past 12 months:</w:t>
-            </w:r>
-          </w:p>
-          <w:p>
-            <w:pPr>
-              <w:pStyle w:val="Heading1"/>
-            </w:pPr>
-            <w:r>
-              <w:rPr>
-                <w:vanish/>
-              </w:rPr>
-              <w:t>3. Roles and Responsibilities (RACI)</w:t>
-            </w:r>
-          </w:p>
-          <w:tbl>
-            <w:tblPr>
-              <w:tblW w:w="6506" w:type="dxa"/>
-              <w:tblBorders>
-                <w:top w:val="single" w:sz="4" w:space="0" w:color="auto"/>
-                <w:left w:val="single" w:sz="4" w:space="0" w:color="auto"/>
-                <w:bottom w:val="single" w:sz="4" w:space="0" w:color="auto"/>
-                <w:right w:val="single" w:sz="4" w:space="0" w:color="auto"/>
-                <w:insideH w:val="single" w:sz="4" w:space="0" w:color="auto"/>
-                <w:insideV w:val="single" w:sz="4" w:space="0" w:color="auto"/>
-              </w:tblBorders>
-              <w:tblCellMar>
-                <w:left w:w="10" w:type="dxa"/>
-                <w:right w:w="10" w:type="dxa"/>
-              </w:tblCellMar>
-              <w:tblLook w:val="04A0" w:firstRow="1" w:lastRow="0" w:firstColumn="1" w:lastColumn="0" w:noHBand="0" w:noVBand="1"/>
-            </w:tblPr>
-            <w:tblGrid>
-              <w:gridCol w:w="1028"/>
-              <w:gridCol w:w="913"/>
-              <w:gridCol w:w="913"/>
-              <w:gridCol w:w="913"/>
-              <w:gridCol w:w="913"/>
-              <w:gridCol w:w="913"/>
-              <w:gridCol w:w="913"/>
-            </w:tblGrid>
-            <w:tr>
-              <w:tc>
-                <w:tcPr>
-                  <w:tcW w:w="900" w:type="dxa"/>
-                  <w:shd w:val="clear" w:color="auto" w:fill="5F0229"/>
-                  <w:tcMar>
-                    <w:top w:w="60" w:type="dxa"/>
-                    <w:left w:w="80" w:type="dxa"/>
-                    <w:bottom w:w="60" w:type="dxa"/>
-                    <w:right w:w="80" w:type="dxa"/>
-                  </w:tcMar>
-                </w:tcPr>
-                <w:p>
-                  <w:pPr>
-                    <w:jc w:val="center"/>
-                  </w:pPr>
-                  <w:r>
-                    <w:rPr>
-                      <w:rFonts w:ascii="Aptos" w:eastAsia="Aptos" w:hAnsi="Aptos" w:cs="Aptos"/>
-                      <w:b/>
-                      <w:bCs/>
-                      <w:color w:val="FFFFFF"/>
-                      <w:sz w:val="18"/>
-                      <w:szCs w:val="18"/>
-                    </w:rPr>
-                    <w:t>Month</w:t>
-                  </w:r>
-                </w:p>
-              </w:tc>
-              <w:tc>
-                <w:tcPr>
-                  <w:tcW w:w="800" w:type="dxa"/>
-                  <w:shd w:val="clear" w:color="auto" w:fill="5F0229"/>
-                  <w:tcMar>
-                    <w:top w:w="60" w:type="dxa"/>
-                    <w:left w:w="80" w:type="dxa"/>
-                    <w:bottom w:w="60" w:type="dxa"/>
-                    <w:right w:w="80" w:type="dxa"/>
-                  </w:tcMar>
-                </w:tcPr>
-                <w:p>
-                  <w:pPr>
-                    <w:jc w:val="center"/>
-                  </w:pPr>
-                  <w:r>
-                    <w:rPr>
-                      <w:rFonts w:ascii="Aptos" w:eastAsia="Aptos" w:hAnsi="Aptos" w:cs="Aptos"/>
-                      <w:b/>
-                      <w:bCs/>
-                      <w:color w:val="FFFFFF"/>
-                      <w:sz w:val="18"/>
-                      <w:szCs w:val="18"/>
-                    </w:rPr>
-                    <w:t>Mar-25</w:t>
-                  </w:r>
-                </w:p>
-              </w:tc>
-              <w:tc>
-                <w:tcPr>
-                  <w:tcW w:w="800" w:type="dxa"/>
-                  <w:shd w:val="clear" w:color="auto" w:fill="5F0229"/>
-                  <w:tcMar>
-                    <w:top w:w="60" w:type="dxa"/>
-                    <w:left w:w="80" w:type="dxa"/>
-                    <w:bottom w:w="60" w:type="dxa"/>
-                    <w:right w:w="80" w:type="dxa"/>
-                  </w:tcMar>
-                </w:tcPr>
-                <w:p>
-                  <w:pPr>
-                    <w:jc w:val="center"/>
-                  </w:pPr>
-                  <w:r>
-                    <w:rPr>
-                      <w:rFonts w:ascii="Aptos" w:eastAsia="Aptos" w:hAnsi="Aptos" w:cs="Aptos"/>
-                      <w:b/>
-                      <w:bCs/>
-                      <w:color w:val="FFFFFF"/>
-                      <w:sz w:val="18"/>
-                      <w:szCs w:val="18"/>
-                    </w:rPr>
-                    <w:t>Apr-25</w:t>
-                  </w:r>
-                </w:p>
-              </w:tc>
-              <w:tc>
-                <w:tcPr>
-                  <w:tcW w:w="800" w:type="dxa"/>
-                  <w:shd w:val="clear" w:color="auto" w:fill="5F0229"/>
-                  <w:tcMar>
-                    <w:top w:w="60" w:type="dxa"/>
-                    <w:left w:w="80" w:type="dxa"/>
-                    <w:bottom w:w="60" w:type="dxa"/>
-                    <w:right w:w="80" w:type="dxa"/>
-                  </w:tcMar>
-                </w:tcPr>
-                <w:p>
-                  <w:pPr>
-                    <w:jc w:val="center"/>
-                  </w:pPr>
-                  <w:r>
-                    <w:rPr>
-                      <w:rFonts w:ascii="Aptos" w:eastAsia="Aptos" w:hAnsi="Aptos" w:cs="Aptos"/>
-                      <w:b/>
-                      <w:bCs/>
-                      <w:color w:val="FFFFFF"/>
-                      <w:sz w:val="18"/>
-                      <w:szCs w:val="18"/>
-                    </w:rPr>
-                    <w:t>May-25</w:t>
-                  </w:r>
-                </w:p>
-              </w:tc>
-              <w:tc>
-                <w:tcPr>
-                  <w:tcW w:w="800" w:type="dxa"/>
-                  <w:shd w:val="clear" w:color="auto" w:fill="5F0229"/>
-                  <w:tcMar>
-                    <w:top w:w="60" w:type="dxa"/>
-                    <w:left w:w="80" w:type="dxa"/>
-                    <w:bottom w:w="60" w:type="dxa"/>
-                    <w:right w:w="80" w:type="dxa"/>
-                  </w:tcMar>
-                </w:tcPr>
-                <w:p>
-                  <w:pPr>
-                    <w:jc w:val="center"/>
-                  </w:pPr>
-                  <w:r>
-                    <w:rPr>
-                      <w:rFonts w:ascii="Aptos" w:eastAsia="Aptos" w:hAnsi="Aptos" w:cs="Aptos"/>
-                      <w:b/>
-                      <w:bCs/>
-                      <w:color w:val="FFFFFF"/>
-                      <w:sz w:val="18"/>
-                      <w:szCs w:val="18"/>
-                    </w:rPr>
-                    <w:t>Jun-25</w:t>
-                  </w:r>
-                </w:p>
-              </w:tc>
-              <w:tc>
-                <w:tcPr>
-                  <w:tcW w:w="800" w:type="dxa"/>
-                  <w:shd w:val="clear" w:color="auto" w:fill="5F0229"/>
-                  <w:tcMar>
-                    <w:top w:w="60" w:type="dxa"/>
-                    <w:left w:w="80" w:type="dxa"/>
-                    <w:bottom w:w="60" w:type="dxa"/>
-                    <w:right w:w="80" w:type="dxa"/>
-                  </w:tcMar>
-                </w:tcPr>
-                <w:p>
-                  <w:pPr>
-                    <w:jc w:val="center"/>
-                  </w:pPr>
-                  <w:r>
-                    <w:rPr>
-                      <w:rFonts w:ascii="Aptos" w:eastAsia="Aptos" w:hAnsi="Aptos" w:cs="Aptos"/>
-                      <w:b/>
-                      <w:bCs/>
-                      <w:color w:val="FFFFFF"/>
-                      <w:sz w:val="18"/>
-                      <w:szCs w:val="18"/>
-                    </w:rPr>
-                    <w:t>Jul-25</w:t>
-                  </w:r>
-                </w:p>
-              </w:tc>
-              <w:tc>
-                <w:tcPr>
-                  <w:tcW w:w="800" w:type="dxa"/>
-                  <w:shd w:val="clear" w:color="auto" w:fill="5F0229"/>
-                  <w:tcMar>
-                    <w:top w:w="60" w:type="dxa"/>
-                    <w:left w:w="80" w:type="dxa"/>
-                    <w:bottom w:w="60" w:type="dxa"/>
-                    <w:right w:w="80" w:type="dxa"/>
-                  </w:tcMar>
-                </w:tcPr>
-                <w:p>
-                  <w:pPr>
-                    <w:jc w:val="center"/>
-                  </w:pPr>
-                  <w:r>
-                    <w:rPr>
-                      <w:rFonts w:ascii="Aptos" w:eastAsia="Aptos" w:hAnsi="Aptos" w:cs="Aptos"/>
-                      <w:b/>
-                      <w:bCs/>
-                      <w:color w:val="FFFFFF"/>
-                      <w:sz w:val="18"/>
-                      <w:szCs w:val="18"/>
-                    </w:rPr>
-                    <w:t>Aug-25</w:t>
-                  </w:r>
-                </w:p>
-              </w:tc>
-            </w:tr>
-            <w:tr>
-              <w:tc>
-                <w:tcPr>
-                  <w:tcW w:w="900" w:type="dxa"/>
-                  <w:shd w:val="clear" w:color="auto" w:fill="F6F2EA"/>
-                  <w:tcMar>
-                    <w:top w:w="60" w:type="dxa"/>
-                    <w:left w:w="80" w:type="dxa"/>
-                    <w:bottom w:w="60" w:type="dxa"/>
-                    <w:right w:w="80" w:type="dxa"/>
-                  </w:tcMar>
-                </w:tcPr>
-                <w:p>
-                  <w:pPr>
-                    <w:jc w:val="center"/>
-                  </w:pPr>
-                  <w:r>
-                    <w:rPr>
-                      <w:rFonts w:ascii="Aptos" w:eastAsia="Aptos" w:hAnsi="Aptos" w:cs="Aptos"/>
-                      <w:b/>
-                      <w:bCs/>
-                      <w:color w:val="4A453D"/>
-                      <w:sz w:val="18"/>
-                      <w:szCs w:val="18"/>
-                    </w:rPr>
-                    <w:t>Volume</w:t>
-                  </w:r>
-                </w:p>
-              </w:tc>
-              <w:tc>
-                <w:tcPr>
-                  <w:tcW w:w="800" w:type="dxa"/>
-                  <w:shd w:val="clear" w:color="auto" w:fill="FFFFFF"/>
-                  <w:tcMar>
-                    <w:top w:w="60" w:type="dxa"/>
-                    <w:left w:w="80" w:type="dxa"/>
-                    <w:bottom w:w="60" w:type="dxa"/>
-                    <w:right w:w="80" w:type="dxa"/>
-                  </w:tcMar>
-                </w:tcPr>
-                <w:p>
-                  <w:pPr>
-                    <w:jc w:val="center"/>
-                  </w:pPr>
-                </w:p>
-              </w:tc>
-              <w:tc>
-                <w:tcPr>
-                  <w:tcW w:w="800" w:type="dxa"/>
-                  <w:shd w:val="clear" w:color="auto" w:fill="FFFFFF"/>
-                  <w:tcMar>
-                    <w:top w:w="60" w:type="dxa"/>
-                    <w:left w:w="80" w:type="dxa"/>
-                    <w:bottom w:w="60" w:type="dxa"/>
-                    <w:right w:w="80" w:type="dxa"/>
-                  </w:tcMar>
-                </w:tcPr>
-                <w:p>
-                  <w:pPr>
-                    <w:jc w:val="center"/>
-                  </w:pPr>
-                </w:p>
-              </w:tc>
-              <w:tc>
-                <w:tcPr>
-                  <w:tcW w:w="800" w:type="dxa"/>
-                  <w:shd w:val="clear" w:color="auto" w:fill="FFFFFF"/>
-                  <w:tcMar>
-                    <w:top w:w="60" w:type="dxa"/>
-                    <w:left w:w="80" w:type="dxa"/>
-                    <w:bottom w:w="60" w:type="dxa"/>
-                    <w:right w:w="80" w:type="dxa"/>
-                  </w:tcMar>
-                </w:tcPr>
-                <w:p>
-                  <w:pPr>
-                    <w:jc w:val="center"/>
-                  </w:pPr>
-                </w:p>
-              </w:tc>
-              <w:tc>
-                <w:tcPr>
-                  <w:tcW w:w="800" w:type="dxa"/>
-                  <w:shd w:val="clear" w:color="auto" w:fill="FFFFFF"/>
-                  <w:tcMar>
-                    <w:top w:w="60" w:type="dxa"/>
-                    <w:left w:w="80" w:type="dxa"/>
-                    <w:bottom w:w="60" w:type="dxa"/>
-                    <w:right w:w="80" w:type="dxa"/>
-                  </w:tcMar>
-                </w:tcPr>
-                <w:p>
-                  <w:pPr>
-                    <w:jc w:val="center"/>
-                  </w:pPr>
-                </w:p>
-              </w:tc>
-              <w:tc>
-                <w:tcPr>
-                  <w:tcW w:w="800" w:type="dxa"/>
-                  <w:shd w:val="clear" w:color="auto" w:fill="FFFFFF"/>
-                  <w:tcMar>
-                    <w:top w:w="60" w:type="dxa"/>
-                    <w:left w:w="80" w:type="dxa"/>
-                    <w:bottom w:w="60" w:type="dxa"/>
-                    <w:right w:w="80" w:type="dxa"/>
-                  </w:tcMar>
-                </w:tcPr>
-                <w:p>
-                  <w:pPr>
-                    <w:jc w:val="center"/>
-                  </w:pPr>
-                </w:p>
-              </w:tc>
-              <w:tc>
-                <w:tcPr>
-                  <w:tcW w:w="800" w:type="dxa"/>
-                  <w:shd w:val="clear" w:color="auto" w:fill="FFFFFF"/>
-                  <w:tcMar>
-                    <w:top w:w="60" w:type="dxa"/>
-                    <w:left w:w="80" w:type="dxa"/>
-                    <w:bottom w:w="60" w:type="dxa"/>
-                    <w:right w:w="80" w:type="dxa"/>
-                  </w:tcMar>
-                </w:tcPr>
-                <w:p>
-                  <w:pPr>
-                    <w:jc w:val="center"/>
-                  </w:pPr>
-                </w:p>
-              </w:tc>
-            </w:tr>
-            <w:tr>
-              <w:tc>
-                <w:tcPr>
-                  <w:tcW w:w="900" w:type="dxa"/>
-                  <w:shd w:val="clear" w:color="auto" w:fill="5F0229"/>
-                  <w:tcMar>
-                    <w:top w:w="60" w:type="dxa"/>
-                    <w:left w:w="80" w:type="dxa"/>
-                    <w:bottom w:w="60" w:type="dxa"/>
-                    <w:right w:w="80" w:type="dxa"/>
-                  </w:tcMar>
-                </w:tcPr>
-                <w:p>
-                  <w:pPr>
-                    <w:jc w:val="center"/>
-                  </w:pPr>
-                  <w:r>
-                    <w:rPr>
-                      <w:rFonts w:ascii="Aptos" w:eastAsia="Aptos" w:hAnsi="Aptos" w:cs="Aptos"/>
-                      <w:b/>
-                      <w:bCs/>
-                      <w:color w:val="FFFFFF"/>
-                      <w:sz w:val="18"/>
-                      <w:szCs w:val="18"/>
-                    </w:rPr>
-                    <w:t>Month</w:t>
-                  </w:r>
-                </w:p>
-              </w:tc>
-              <w:tc>
-                <w:tcPr>
-                  <w:tcW w:w="800" w:type="dxa"/>
-                  <w:shd w:val="clear" w:color="auto" w:fill="5F0229"/>
-                  <w:tcMar>
-                    <w:top w:w="60" w:type="dxa"/>
-                    <w:left w:w="80" w:type="dxa"/>
-                    <w:bottom w:w="60" w:type="dxa"/>
-                    <w:right w:w="80" w:type="dxa"/>
-                  </w:tcMar>
-                </w:tcPr>
-                <w:p>
-                  <w:pPr>
-                    <w:jc w:val="center"/>
-                  </w:pPr>
-                  <w:r>
-                    <w:rPr>
-                      <w:rFonts w:ascii="Aptos" w:eastAsia="Aptos" w:hAnsi="Aptos" w:cs="Aptos"/>
-                      <w:b/>
-                      <w:bCs/>
-                      <w:color w:val="FFFFFF"/>
-                      <w:sz w:val="18"/>
-                      <w:szCs w:val="18"/>
-                    </w:rPr>
-                    <w:t>Sep-25</w:t>
-                  </w:r>
-                </w:p>
-              </w:tc>
-              <w:tc>
-                <w:tcPr>
-                  <w:tcW w:w="800" w:type="dxa"/>
-                  <w:shd w:val="clear" w:color="auto" w:fill="5F0229"/>
-                  <w:tcMar>
-                    <w:top w:w="60" w:type="dxa"/>
-                    <w:left w:w="80" w:type="dxa"/>
-                    <w:bottom w:w="60" w:type="dxa"/>
-                    <w:right w:w="80" w:type="dxa"/>
-                  </w:tcMar>
-                </w:tcPr>
-                <w:p>
-                  <w:pPr>
-                    <w:jc w:val="center"/>
-                  </w:pPr>
-                  <w:r>
-                    <w:rPr>
-                      <w:rFonts w:ascii="Aptos" w:eastAsia="Aptos" w:hAnsi="Aptos" w:cs="Aptos"/>
-                      <w:b/>
-                      <w:bCs/>
-                      <w:color w:val="FFFFFF"/>
-                      <w:sz w:val="18"/>
-                      <w:szCs w:val="18"/>
-                    </w:rPr>
-                    <w:t>Oct-25</w:t>
-                  </w:r>
-                </w:p>
-              </w:tc>
-              <w:tc>
-                <w:tcPr>
-                  <w:tcW w:w="800" w:type="dxa"/>
-                  <w:shd w:val="clear" w:color="auto" w:fill="5F0229"/>
-                  <w:tcMar>
-                    <w:top w:w="60" w:type="dxa"/>
-                    <w:left w:w="80" w:type="dxa"/>
-                    <w:bottom w:w="60" w:type="dxa"/>
-                    <w:right w:w="80" w:type="dxa"/>
-                  </w:tcMar>
-                </w:tcPr>
-                <w:p>
-                  <w:pPr>
-                    <w:jc w:val="center"/>
-                  </w:pPr>
-                  <w:r>
-                    <w:rPr>
-                      <w:rFonts w:ascii="Aptos" w:eastAsia="Aptos" w:hAnsi="Aptos" w:cs="Aptos"/>
-                      <w:b/>
-                      <w:bCs/>
-                      <w:color w:val="FFFFFF"/>
-                      <w:sz w:val="18"/>
-                      <w:szCs w:val="18"/>
-                    </w:rPr>
-                    <w:t>Nov-25</w:t>
-                  </w:r>
-                </w:p>
-              </w:tc>
-              <w:tc>
-                <w:tcPr>
-                  <w:tcW w:w="800" w:type="dxa"/>
-                  <w:shd w:val="clear" w:color="auto" w:fill="5F0229"/>
-                  <w:tcMar>
-                    <w:top w:w="60" w:type="dxa"/>
-                    <w:left w:w="80" w:type="dxa"/>
-                    <w:bottom w:w="60" w:type="dxa"/>
-                    <w:right w:w="80" w:type="dxa"/>
-                  </w:tcMar>
-                </w:tcPr>
-                <w:p>
-                  <w:pPr>
-                    <w:jc w:val="center"/>
-                  </w:pPr>
-                  <w:r>
-                    <w:rPr>
-                      <w:rFonts w:ascii="Aptos" w:eastAsia="Aptos" w:hAnsi="Aptos" w:cs="Aptos"/>
-                      <w:b/>
-                      <w:bCs/>
-                      <w:color w:val="FFFFFF"/>
-                      <w:sz w:val="18"/>
-                      <w:szCs w:val="18"/>
-                    </w:rPr>
-                    <w:t>Dec-25</w:t>
-                  </w:r>
-                </w:p>
-              </w:tc>
-              <w:tc>
-                <w:tcPr>
-                  <w:tcW w:w="800" w:type="dxa"/>
-                  <w:shd w:val="clear" w:color="auto" w:fill="5F0229"/>
-                  <w:tcMar>
-                    <w:top w:w="60" w:type="dxa"/>
-                    <w:left w:w="80" w:type="dxa"/>
-                    <w:bottom w:w="60" w:type="dxa"/>
-                    <w:right w:w="80" w:type="dxa"/>
-                  </w:tcMar>
-                </w:tcPr>
-                <w:p>
-                  <w:pPr>
-                    <w:jc w:val="center"/>
-                  </w:pPr>
-                  <w:r>
-                    <w:rPr>
-                      <w:rFonts w:ascii="Aptos" w:eastAsia="Aptos" w:hAnsi="Aptos" w:cs="Aptos"/>
-                      <w:b/>
-                      <w:bCs/>
-                      <w:color w:val="FFFFFF"/>
-                      <w:sz w:val="18"/>
-                      <w:szCs w:val="18"/>
-                    </w:rPr>
-                    <w:t>Jan-26</w:t>
-                  </w:r>
-                </w:p>
-              </w:tc>
-              <w:tc>
-                <w:tcPr>
-                  <w:tcW w:w="800" w:type="dxa"/>
-                  <w:shd w:val="clear" w:color="auto" w:fill="5F0229"/>
-                  <w:tcMar>
-                    <w:top w:w="60" w:type="dxa"/>
-                    <w:left w:w="80" w:type="dxa"/>
-                    <w:bottom w:w="60" w:type="dxa"/>
-                    <w:right w:w="80" w:type="dxa"/>
-                  </w:tcMar>
-                </w:tcPr>
-                <w:p>
-                  <w:pPr>
-                    <w:jc w:val="center"/>
-                  </w:pPr>
-                  <w:r>
-                    <w:rPr>
-                      <w:rFonts w:ascii="Aptos" w:eastAsia="Aptos" w:hAnsi="Aptos" w:cs="Aptos"/>
-                      <w:b/>
-                      <w:bCs/>
-                      <w:color w:val="FFFFFF"/>
-                      <w:sz w:val="18"/>
-                      <w:szCs w:val="18"/>
-                    </w:rPr>
-                    <w:t>Feb-26</w:t>
-                  </w:r>
-                </w:p>
-              </w:tc>
-            </w:tr>
-            <w:tr>
-              <w:tc>
-                <w:tcPr>
-                  <w:tcW w:w="900" w:type="dxa"/>
-                  <w:shd w:val="clear" w:color="auto" w:fill="F6F2EA"/>
-                  <w:tcMar>
-                    <w:top w:w="60" w:type="dxa"/>
-                    <w:left w:w="80" w:type="dxa"/>
-                    <w:bottom w:w="60" w:type="dxa"/>
-                    <w:right w:w="80" w:type="dxa"/>
-                  </w:tcMar>
-                </w:tcPr>
-                <w:p>
-                  <w:pPr>
-                    <w:jc w:val="center"/>
-                  </w:pPr>
-                  <w:r>
-                    <w:rPr>
-                      <w:rFonts w:ascii="Aptos" w:eastAsia="Aptos" w:hAnsi="Aptos" w:cs="Aptos"/>
-                      <w:b/>
-                      <w:bCs/>
-                      <w:color w:val="4A453D"/>
-                      <w:sz w:val="18"/>
-                      <w:szCs w:val="18"/>
-                    </w:rPr>
-                    <w:t>Volume</w:t>
-                  </w:r>
-                </w:p>
-              </w:tc>
-              <w:tc>
-                <w:tcPr>
-                  <w:tcW w:w="800" w:type="dxa"/>
-                  <w:shd w:val="clear" w:color="auto" w:fill="FFFFFF"/>
-                  <w:tcMar>
-                    <w:top w:w="60" w:type="dxa"/>
-                    <w:left w:w="80" w:type="dxa"/>
-                    <w:bottom w:w="60" w:type="dxa"/>
-                    <w:right w:w="80" w:type="dxa"/>
-                  </w:tcMar>
-                </w:tcPr>
-                <w:p>
-                  <w:pPr>
-                    <w:jc w:val="center"/>
-                  </w:pPr>
-                </w:p>
-              </w:tc>
-              <w:tc>
-                <w:tcPr>
-                  <w:tcW w:w="800" w:type="dxa"/>
-                  <w:shd w:val="clear" w:color="auto" w:fill="FFFFFF"/>
-                  <w:tcMar>
-                    <w:top w:w="60" w:type="dxa"/>
-                    <w:left w:w="80" w:type="dxa"/>
-                    <w:bottom w:w="60" w:type="dxa"/>
-                    <w:right w:w="80" w:type="dxa"/>
-                  </w:tcMar>
-                </w:tcPr>
-                <w:p>
-                  <w:pPr>
-                    <w:jc w:val="center"/>
-                  </w:pPr>
-                </w:p>
-              </w:tc>
-              <w:tc>
-                <w:tcPr>
-                  <w:tcW w:w="800" w:type="dxa"/>
-                  <w:shd w:val="clear" w:color="auto" w:fill="FFFFFF"/>
-                  <w:tcMar>
-                    <w:top w:w="60" w:type="dxa"/>
-                    <w:left w:w="80" w:type="dxa"/>
-                    <w:bottom w:w="60" w:type="dxa"/>
-                    <w:right w:w="80" w:type="dxa"/>
-                  </w:tcMar>
-                </w:tcPr>
-                <w:p>
-                  <w:pPr>
-                    <w:jc w:val="center"/>
-                  </w:pPr>
-                </w:p>
-              </w:tc>
-              <w:tc>
-                <w:tcPr>
-                  <w:tcW w:w="800" w:type="dxa"/>
-                  <w:shd w:val="clear" w:color="auto" w:fill="FFFFFF"/>
-                  <w:tcMar>
-                    <w:top w:w="60" w:type="dxa"/>
-                    <w:left w:w="80" w:type="dxa"/>
-                    <w:bottom w:w="60" w:type="dxa"/>
-                    <w:right w:w="80" w:type="dxa"/>
-                  </w:tcMar>
-                </w:tcPr>
-                <w:p>
-                  <w:pPr>
-                    <w:jc w:val="center"/>
-                  </w:pPr>
-                </w:p>
-              </w:tc>
-              <w:tc>
-                <w:tcPr>
-                  <w:tcW w:w="800" w:type="dxa"/>
-                  <w:shd w:val="clear" w:color="auto" w:fill="FFFFFF"/>
-                  <w:tcMar>
-                    <w:top w:w="60" w:type="dxa"/>
-                    <w:left w:w="80" w:type="dxa"/>
-                    <w:bottom w:w="60" w:type="dxa"/>
-                    <w:right w:w="80" w:type="dxa"/>
-                  </w:tcMar>
-                </w:tcPr>
-                <w:p>
-                  <w:pPr>
-                    <w:jc w:val="center"/>
-                  </w:pPr>
-                </w:p>
-              </w:tc>
-              <w:tc>
-                <w:tcPr>
-                  <w:tcW w:w="800" w:type="dxa"/>
-                  <w:shd w:val="clear" w:color="auto" w:fill="FFFFFF"/>
-                  <w:tcMar>
-                    <w:top w:w="60" w:type="dxa"/>
-                    <w:left w:w="80" w:type="dxa"/>
-                    <w:bottom w:w="60" w:type="dxa"/>
-                    <w:right w:w="80" w:type="dxa"/>
-                  </w:tcMar>
-                </w:tcPr>
-                <w:p>
-                  <w:pPr>
-                    <w:jc w:val="center"/>
-                  </w:pPr>
-                </w:p>
-              </w:tc>
-            </w:tr>
-          </w:tbl>
-          <w:p/>
+            <w:r>
+              <w:t xml:space="preserve">[RACI Sharepoint]</w:t>
+            </w:r>
+          </w:p>
         </w:tc>
       </w:tr>
       <w:tr>

</xml_diff>

<commit_message>
plan: fix AI generation - token cap, RACI, volumetrics, placeholder echo
Agent-Logs-Url: https://github.com/livesid44/iqflowagent/sessions/18449804-5ed9-4dce-a74d-37c5eb7ea3fe

Co-authored-by: livesid44 <169084330+livesid44@users.noreply.github.com>
</commit_message>
<xml_diff>
--- a/src/IQFlowAgent.Web/wwwroot/templates/BARTOK_S8_SOP_Template_v2.docx
+++ b/src/IQFlowAgent.Web/wwwroot/templates/BARTOK_S8_SOP_Template_v2.docx
@@ -3872,10 +3872,708 @@
             </w:tcMar>
           </w:tcPr>
           <w:p>
-            <w:r>
-              <w:t xml:space="preserve">[RACI Sharepoint]</w:t>
-            </w:r>
-          </w:p>
+            <w:pPr>
+              <w:spacing w:after="60"/>
+            </w:pPr>
+            <w:r>
+              <w:rPr>
+                <w:rFonts w:ascii="Aptos" w:eastAsia="Aptos" w:hAnsi="Aptos" w:cs="Aptos"/>
+                <w:i/>
+                <w:iCs/>
+                <w:color w:val="777777"/>
+                <w:sz w:val="18"/>
+                <w:szCs w:val="18"/>
+              </w:rPr>
+              <w:t>Enter actual transaction volume for each of the past 12 months:</w:t>
+            </w:r>
+          </w:p>
+          <w:tbl>
+            <w:tblPr>
+              <w:tblW w:w="6506" w:type="dxa"/>
+              <w:tblBorders>
+                <w:top w:val="single" w:sz="4" w:space="0" w:color="auto"/>
+                <w:left w:val="single" w:sz="4" w:space="0" w:color="auto"/>
+                <w:bottom w:val="single" w:sz="4" w:space="0" w:color="auto"/>
+                <w:right w:val="single" w:sz="4" w:space="0" w:color="auto"/>
+                <w:insideH w:val="single" w:sz="4" w:space="0" w:color="auto"/>
+                <w:insideV w:val="single" w:sz="4" w:space="0" w:color="auto"/>
+              </w:tblBorders>
+              <w:tblCellMar>
+                <w:left w:w="10" w:type="dxa"/>
+                <w:right w:w="10" w:type="dxa"/>
+              </w:tblCellMar>
+              <w:tblLook w:val="04A0" w:firstRow="1" w:lastRow="0" w:firstColumn="1" w:lastColumn="0" w:noHBand="0" w:noVBand="1"/>
+            </w:tblPr>
+            <w:tblGrid>
+              <w:gridCol w:w="1028"/>
+              <w:gridCol w:w="913"/>
+              <w:gridCol w:w="913"/>
+              <w:gridCol w:w="913"/>
+              <w:gridCol w:w="913"/>
+              <w:gridCol w:w="913"/>
+              <w:gridCol w:w="913"/>
+            </w:tblGrid>
+            <w:tr>
+              <w:tc>
+                <w:tcPr>
+                  <w:tcW w:w="900" w:type="dxa"/>
+                  <w:shd w:val="clear" w:color="auto" w:fill="5F0229"/>
+                  <w:tcMar>
+                    <w:top w:w="60" w:type="dxa"/>
+                    <w:left w:w="80" w:type="dxa"/>
+                    <w:bottom w:w="60" w:type="dxa"/>
+                    <w:right w:w="80" w:type="dxa"/>
+                  </w:tcMar>
+                </w:tcPr>
+                <w:p>
+                  <w:pPr>
+                    <w:jc w:val="center"/>
+                  </w:pPr>
+                  <w:r>
+                    <w:rPr>
+                      <w:rFonts w:ascii="Aptos" w:eastAsia="Aptos" w:hAnsi="Aptos" w:cs="Aptos"/>
+                      <w:b/>
+                      <w:bCs/>
+                      <w:color w:val="FFFFFF"/>
+                      <w:sz w:val="18"/>
+                      <w:szCs w:val="18"/>
+                    </w:rPr>
+                    <w:t>Month</w:t>
+                  </w:r>
+                </w:p>
+              </w:tc>
+              <w:tc>
+                <w:tcPr>
+                  <w:tcW w:w="800" w:type="dxa"/>
+                  <w:shd w:val="clear" w:color="auto" w:fill="5F0229"/>
+                  <w:tcMar>
+                    <w:top w:w="60" w:type="dxa"/>
+                    <w:left w:w="80" w:type="dxa"/>
+                    <w:bottom w:w="60" w:type="dxa"/>
+                    <w:right w:w="80" w:type="dxa"/>
+                  </w:tcMar>
+                </w:tcPr>
+                <w:p>
+                  <w:pPr>
+                    <w:jc w:val="center"/>
+                  </w:pPr>
+                  <w:r>
+                    <w:rPr>
+                      <w:rFonts w:ascii="Aptos" w:eastAsia="Aptos" w:hAnsi="Aptos" w:cs="Aptos"/>
+                      <w:b/>
+                      <w:bCs/>
+                      <w:color w:val="FFFFFF"/>
+                      <w:sz w:val="18"/>
+                      <w:szCs w:val="18"/>
+                    </w:rPr>
+                    <w:t>Mar-25</w:t>
+                  </w:r>
+                </w:p>
+              </w:tc>
+              <w:tc>
+                <w:tcPr>
+                  <w:tcW w:w="800" w:type="dxa"/>
+                  <w:shd w:val="clear" w:color="auto" w:fill="5F0229"/>
+                  <w:tcMar>
+                    <w:top w:w="60" w:type="dxa"/>
+                    <w:left w:w="80" w:type="dxa"/>
+                    <w:bottom w:w="60" w:type="dxa"/>
+                    <w:right w:w="80" w:type="dxa"/>
+                  </w:tcMar>
+                </w:tcPr>
+                <w:p>
+                  <w:pPr>
+                    <w:jc w:val="center"/>
+                  </w:pPr>
+                  <w:r>
+                    <w:rPr>
+                      <w:rFonts w:ascii="Aptos" w:eastAsia="Aptos" w:hAnsi="Aptos" w:cs="Aptos"/>
+                      <w:b/>
+                      <w:bCs/>
+                      <w:color w:val="FFFFFF"/>
+                      <w:sz w:val="18"/>
+                      <w:szCs w:val="18"/>
+                    </w:rPr>
+                    <w:t>Apr-25</w:t>
+                  </w:r>
+                </w:p>
+              </w:tc>
+              <w:tc>
+                <w:tcPr>
+                  <w:tcW w:w="800" w:type="dxa"/>
+                  <w:shd w:val="clear" w:color="auto" w:fill="5F0229"/>
+                  <w:tcMar>
+                    <w:top w:w="60" w:type="dxa"/>
+                    <w:left w:w="80" w:type="dxa"/>
+                    <w:bottom w:w="60" w:type="dxa"/>
+                    <w:right w:w="80" w:type="dxa"/>
+                  </w:tcMar>
+                </w:tcPr>
+                <w:p>
+                  <w:pPr>
+                    <w:jc w:val="center"/>
+                  </w:pPr>
+                  <w:r>
+                    <w:rPr>
+                      <w:rFonts w:ascii="Aptos" w:eastAsia="Aptos" w:hAnsi="Aptos" w:cs="Aptos"/>
+                      <w:b/>
+                      <w:bCs/>
+                      <w:color w:val="FFFFFF"/>
+                      <w:sz w:val="18"/>
+                      <w:szCs w:val="18"/>
+                    </w:rPr>
+                    <w:t>May-25</w:t>
+                  </w:r>
+                </w:p>
+              </w:tc>
+              <w:tc>
+                <w:tcPr>
+                  <w:tcW w:w="800" w:type="dxa"/>
+                  <w:shd w:val="clear" w:color="auto" w:fill="5F0229"/>
+                  <w:tcMar>
+                    <w:top w:w="60" w:type="dxa"/>
+                    <w:left w:w="80" w:type="dxa"/>
+                    <w:bottom w:w="60" w:type="dxa"/>
+                    <w:right w:w="80" w:type="dxa"/>
+                  </w:tcMar>
+                </w:tcPr>
+                <w:p>
+                  <w:pPr>
+                    <w:jc w:val="center"/>
+                  </w:pPr>
+                  <w:r>
+                    <w:rPr>
+                      <w:rFonts w:ascii="Aptos" w:eastAsia="Aptos" w:hAnsi="Aptos" w:cs="Aptos"/>
+                      <w:b/>
+                      <w:bCs/>
+                      <w:color w:val="FFFFFF"/>
+                      <w:sz w:val="18"/>
+                      <w:szCs w:val="18"/>
+                    </w:rPr>
+                    <w:t>Jun-25</w:t>
+                  </w:r>
+                </w:p>
+              </w:tc>
+              <w:tc>
+                <w:tcPr>
+                  <w:tcW w:w="800" w:type="dxa"/>
+                  <w:shd w:val="clear" w:color="auto" w:fill="5F0229"/>
+                  <w:tcMar>
+                    <w:top w:w="60" w:type="dxa"/>
+                    <w:left w:w="80" w:type="dxa"/>
+                    <w:bottom w:w="60" w:type="dxa"/>
+                    <w:right w:w="80" w:type="dxa"/>
+                  </w:tcMar>
+                </w:tcPr>
+                <w:p>
+                  <w:pPr>
+                    <w:jc w:val="center"/>
+                  </w:pPr>
+                  <w:r>
+                    <w:rPr>
+                      <w:rFonts w:ascii="Aptos" w:eastAsia="Aptos" w:hAnsi="Aptos" w:cs="Aptos"/>
+                      <w:b/>
+                      <w:bCs/>
+                      <w:color w:val="FFFFFF"/>
+                      <w:sz w:val="18"/>
+                      <w:szCs w:val="18"/>
+                    </w:rPr>
+                    <w:t>Jul-25</w:t>
+                  </w:r>
+                </w:p>
+              </w:tc>
+              <w:tc>
+                <w:tcPr>
+                  <w:tcW w:w="800" w:type="dxa"/>
+                  <w:shd w:val="clear" w:color="auto" w:fill="5F0229"/>
+                  <w:tcMar>
+                    <w:top w:w="60" w:type="dxa"/>
+                    <w:left w:w="80" w:type="dxa"/>
+                    <w:bottom w:w="60" w:type="dxa"/>
+                    <w:right w:w="80" w:type="dxa"/>
+                  </w:tcMar>
+                </w:tcPr>
+                <w:p>
+                  <w:pPr>
+                    <w:jc w:val="center"/>
+                  </w:pPr>
+                  <w:r>
+                    <w:rPr>
+                      <w:rFonts w:ascii="Aptos" w:eastAsia="Aptos" w:hAnsi="Aptos" w:cs="Aptos"/>
+                      <w:b/>
+                      <w:bCs/>
+                      <w:color w:val="FFFFFF"/>
+                      <w:sz w:val="18"/>
+                      <w:szCs w:val="18"/>
+                    </w:rPr>
+                    <w:t>Aug-25</w:t>
+                  </w:r>
+                </w:p>
+              </w:tc>
+            </w:tr>
+            <w:tr>
+              <w:tc>
+                <w:tcPr>
+                  <w:tcW w:w="900" w:type="dxa"/>
+                  <w:shd w:val="clear" w:color="auto" w:fill="F6F2EA"/>
+                  <w:tcMar>
+                    <w:top w:w="60" w:type="dxa"/>
+                    <w:left w:w="80" w:type="dxa"/>
+                    <w:bottom w:w="60" w:type="dxa"/>
+                    <w:right w:w="80" w:type="dxa"/>
+                  </w:tcMar>
+                </w:tcPr>
+                <w:p>
+                  <w:pPr>
+                    <w:jc w:val="center"/>
+                  </w:pPr>
+                  <w:r>
+                    <w:rPr>
+                      <w:rFonts w:ascii="Aptos" w:eastAsia="Aptos" w:hAnsi="Aptos" w:cs="Aptos"/>
+                      <w:b/>
+                      <w:bCs/>
+                      <w:color w:val="4A453D"/>
+                      <w:sz w:val="18"/>
+                      <w:szCs w:val="18"/>
+                    </w:rPr>
+                    <w:t>Volume</w:t>
+                  </w:r>
+                </w:p>
+              </w:tc>
+              <w:tc>
+                <w:tcPr>
+                  <w:tcW w:w="800" w:type="dxa"/>
+                  <w:shd w:val="clear" w:color="auto" w:fill="FFFFFF"/>
+                  <w:tcMar>
+                    <w:top w:w="60" w:type="dxa"/>
+                    <w:left w:w="80" w:type="dxa"/>
+                    <w:bottom w:w="60" w:type="dxa"/>
+                    <w:right w:w="80" w:type="dxa"/>
+                  </w:tcMar>
+                </w:tcPr>
+                <w:p>
+                  <w:pPr>
+                    <w:jc w:val="center"/>
+                  </w:pPr>
+                </w:p>
+              </w:tc>
+              <w:tc>
+                <w:tcPr>
+                  <w:tcW w:w="800" w:type="dxa"/>
+                  <w:shd w:val="clear" w:color="auto" w:fill="FFFFFF"/>
+                  <w:tcMar>
+                    <w:top w:w="60" w:type="dxa"/>
+                    <w:left w:w="80" w:type="dxa"/>
+                    <w:bottom w:w="60" w:type="dxa"/>
+                    <w:right w:w="80" w:type="dxa"/>
+                  </w:tcMar>
+                </w:tcPr>
+                <w:p>
+                  <w:pPr>
+                    <w:jc w:val="center"/>
+                  </w:pPr>
+                </w:p>
+              </w:tc>
+              <w:tc>
+                <w:tcPr>
+                  <w:tcW w:w="800" w:type="dxa"/>
+                  <w:shd w:val="clear" w:color="auto" w:fill="FFFFFF"/>
+                  <w:tcMar>
+                    <w:top w:w="60" w:type="dxa"/>
+                    <w:left w:w="80" w:type="dxa"/>
+                    <w:bottom w:w="60" w:type="dxa"/>
+                    <w:right w:w="80" w:type="dxa"/>
+                  </w:tcMar>
+                </w:tcPr>
+                <w:p>
+                  <w:pPr>
+                    <w:jc w:val="center"/>
+                  </w:pPr>
+                </w:p>
+              </w:tc>
+              <w:tc>
+                <w:tcPr>
+                  <w:tcW w:w="800" w:type="dxa"/>
+                  <w:shd w:val="clear" w:color="auto" w:fill="FFFFFF"/>
+                  <w:tcMar>
+                    <w:top w:w="60" w:type="dxa"/>
+                    <w:left w:w="80" w:type="dxa"/>
+                    <w:bottom w:w="60" w:type="dxa"/>
+                    <w:right w:w="80" w:type="dxa"/>
+                  </w:tcMar>
+                </w:tcPr>
+                <w:p>
+                  <w:pPr>
+                    <w:jc w:val="center"/>
+                  </w:pPr>
+                </w:p>
+              </w:tc>
+              <w:tc>
+                <w:tcPr>
+                  <w:tcW w:w="800" w:type="dxa"/>
+                  <w:shd w:val="clear" w:color="auto" w:fill="FFFFFF"/>
+                  <w:tcMar>
+                    <w:top w:w="60" w:type="dxa"/>
+                    <w:left w:w="80" w:type="dxa"/>
+                    <w:bottom w:w="60" w:type="dxa"/>
+                    <w:right w:w="80" w:type="dxa"/>
+                  </w:tcMar>
+                </w:tcPr>
+                <w:p>
+                  <w:pPr>
+                    <w:jc w:val="center"/>
+                  </w:pPr>
+                </w:p>
+              </w:tc>
+              <w:tc>
+                <w:tcPr>
+                  <w:tcW w:w="800" w:type="dxa"/>
+                  <w:shd w:val="clear" w:color="auto" w:fill="FFFFFF"/>
+                  <w:tcMar>
+                    <w:top w:w="60" w:type="dxa"/>
+                    <w:left w:w="80" w:type="dxa"/>
+                    <w:bottom w:w="60" w:type="dxa"/>
+                    <w:right w:w="80" w:type="dxa"/>
+                  </w:tcMar>
+                </w:tcPr>
+                <w:p>
+                  <w:pPr>
+                    <w:jc w:val="center"/>
+                  </w:pPr>
+                </w:p>
+              </w:tc>
+            </w:tr>
+            <w:tr>
+              <w:tc>
+                <w:tcPr>
+                  <w:tcW w:w="900" w:type="dxa"/>
+                  <w:shd w:val="clear" w:color="auto" w:fill="5F0229"/>
+                  <w:tcMar>
+                    <w:top w:w="60" w:type="dxa"/>
+                    <w:left w:w="80" w:type="dxa"/>
+                    <w:bottom w:w="60" w:type="dxa"/>
+                    <w:right w:w="80" w:type="dxa"/>
+                  </w:tcMar>
+                </w:tcPr>
+                <w:p>
+                  <w:pPr>
+                    <w:jc w:val="center"/>
+                  </w:pPr>
+                  <w:r>
+                    <w:rPr>
+                      <w:rFonts w:ascii="Aptos" w:eastAsia="Aptos" w:hAnsi="Aptos" w:cs="Aptos"/>
+                      <w:b/>
+                      <w:bCs/>
+                      <w:color w:val="FFFFFF"/>
+                      <w:sz w:val="18"/>
+                      <w:szCs w:val="18"/>
+                    </w:rPr>
+                    <w:t>Month</w:t>
+                  </w:r>
+                </w:p>
+              </w:tc>
+              <w:tc>
+                <w:tcPr>
+                  <w:tcW w:w="800" w:type="dxa"/>
+                  <w:shd w:val="clear" w:color="auto" w:fill="5F0229"/>
+                  <w:tcMar>
+                    <w:top w:w="60" w:type="dxa"/>
+                    <w:left w:w="80" w:type="dxa"/>
+                    <w:bottom w:w="60" w:type="dxa"/>
+                    <w:right w:w="80" w:type="dxa"/>
+                  </w:tcMar>
+                </w:tcPr>
+                <w:p>
+                  <w:pPr>
+                    <w:jc w:val="center"/>
+                  </w:pPr>
+                  <w:r>
+                    <w:rPr>
+                      <w:rFonts w:ascii="Aptos" w:eastAsia="Aptos" w:hAnsi="Aptos" w:cs="Aptos"/>
+                      <w:b/>
+                      <w:bCs/>
+                      <w:color w:val="FFFFFF"/>
+                      <w:sz w:val="18"/>
+                      <w:szCs w:val="18"/>
+                    </w:rPr>
+                    <w:t>Sep-25</w:t>
+                  </w:r>
+                </w:p>
+              </w:tc>
+              <w:tc>
+                <w:tcPr>
+                  <w:tcW w:w="800" w:type="dxa"/>
+                  <w:shd w:val="clear" w:color="auto" w:fill="5F0229"/>
+                  <w:tcMar>
+                    <w:top w:w="60" w:type="dxa"/>
+                    <w:left w:w="80" w:type="dxa"/>
+                    <w:bottom w:w="60" w:type="dxa"/>
+                    <w:right w:w="80" w:type="dxa"/>
+                  </w:tcMar>
+                </w:tcPr>
+                <w:p>
+                  <w:pPr>
+                    <w:jc w:val="center"/>
+                  </w:pPr>
+                  <w:r>
+                    <w:rPr>
+                      <w:rFonts w:ascii="Aptos" w:eastAsia="Aptos" w:hAnsi="Aptos" w:cs="Aptos"/>
+                      <w:b/>
+                      <w:bCs/>
+                      <w:color w:val="FFFFFF"/>
+                      <w:sz w:val="18"/>
+                      <w:szCs w:val="18"/>
+                    </w:rPr>
+                    <w:t>Oct-25</w:t>
+                  </w:r>
+                </w:p>
+              </w:tc>
+              <w:tc>
+                <w:tcPr>
+                  <w:tcW w:w="800" w:type="dxa"/>
+                  <w:shd w:val="clear" w:color="auto" w:fill="5F0229"/>
+                  <w:tcMar>
+                    <w:top w:w="60" w:type="dxa"/>
+                    <w:left w:w="80" w:type="dxa"/>
+                    <w:bottom w:w="60" w:type="dxa"/>
+                    <w:right w:w="80" w:type="dxa"/>
+                  </w:tcMar>
+                </w:tcPr>
+                <w:p>
+                  <w:pPr>
+                    <w:jc w:val="center"/>
+                  </w:pPr>
+                  <w:r>
+                    <w:rPr>
+                      <w:rFonts w:ascii="Aptos" w:eastAsia="Aptos" w:hAnsi="Aptos" w:cs="Aptos"/>
+                      <w:b/>
+                      <w:bCs/>
+                      <w:color w:val="FFFFFF"/>
+                      <w:sz w:val="18"/>
+                      <w:szCs w:val="18"/>
+                    </w:rPr>
+                    <w:t>Nov-25</w:t>
+                  </w:r>
+                </w:p>
+              </w:tc>
+              <w:tc>
+                <w:tcPr>
+                  <w:tcW w:w="800" w:type="dxa"/>
+                  <w:shd w:val="clear" w:color="auto" w:fill="5F0229"/>
+                  <w:tcMar>
+                    <w:top w:w="60" w:type="dxa"/>
+                    <w:left w:w="80" w:type="dxa"/>
+                    <w:bottom w:w="60" w:type="dxa"/>
+                    <w:right w:w="80" w:type="dxa"/>
+                  </w:tcMar>
+                </w:tcPr>
+                <w:p>
+                  <w:pPr>
+                    <w:jc w:val="center"/>
+                  </w:pPr>
+                  <w:r>
+                    <w:rPr>
+                      <w:rFonts w:ascii="Aptos" w:eastAsia="Aptos" w:hAnsi="Aptos" w:cs="Aptos"/>
+                      <w:b/>
+                      <w:bCs/>
+                      <w:color w:val="FFFFFF"/>
+                      <w:sz w:val="18"/>
+                      <w:szCs w:val="18"/>
+                    </w:rPr>
+                    <w:t>Dec-25</w:t>
+                  </w:r>
+                </w:p>
+              </w:tc>
+              <w:tc>
+                <w:tcPr>
+                  <w:tcW w:w="800" w:type="dxa"/>
+                  <w:shd w:val="clear" w:color="auto" w:fill="5F0229"/>
+                  <w:tcMar>
+                    <w:top w:w="60" w:type="dxa"/>
+                    <w:left w:w="80" w:type="dxa"/>
+                    <w:bottom w:w="60" w:type="dxa"/>
+                    <w:right w:w="80" w:type="dxa"/>
+                  </w:tcMar>
+                </w:tcPr>
+                <w:p>
+                  <w:pPr>
+                    <w:jc w:val="center"/>
+                  </w:pPr>
+                  <w:r>
+                    <w:rPr>
+                      <w:rFonts w:ascii="Aptos" w:eastAsia="Aptos" w:hAnsi="Aptos" w:cs="Aptos"/>
+                      <w:b/>
+                      <w:bCs/>
+                      <w:color w:val="FFFFFF"/>
+                      <w:sz w:val="18"/>
+                      <w:szCs w:val="18"/>
+                    </w:rPr>
+                    <w:t>Jan-26</w:t>
+                  </w:r>
+                </w:p>
+              </w:tc>
+              <w:tc>
+                <w:tcPr>
+                  <w:tcW w:w="800" w:type="dxa"/>
+                  <w:shd w:val="clear" w:color="auto" w:fill="5F0229"/>
+                  <w:tcMar>
+                    <w:top w:w="60" w:type="dxa"/>
+                    <w:left w:w="80" w:type="dxa"/>
+                    <w:bottom w:w="60" w:type="dxa"/>
+                    <w:right w:w="80" w:type="dxa"/>
+                  </w:tcMar>
+                </w:tcPr>
+                <w:p>
+                  <w:pPr>
+                    <w:jc w:val="center"/>
+                  </w:pPr>
+                  <w:r>
+                    <w:rPr>
+                      <w:rFonts w:ascii="Aptos" w:eastAsia="Aptos" w:hAnsi="Aptos" w:cs="Aptos"/>
+                      <w:b/>
+                      <w:bCs/>
+                      <w:color w:val="FFFFFF"/>
+                      <w:sz w:val="18"/>
+                      <w:szCs w:val="18"/>
+                    </w:rPr>
+                    <w:t>Feb-26</w:t>
+                  </w:r>
+                </w:p>
+              </w:tc>
+            </w:tr>
+            <w:tr>
+              <w:tc>
+                <w:tcPr>
+                  <w:tcW w:w="900" w:type="dxa"/>
+                  <w:shd w:val="clear" w:color="auto" w:fill="F6F2EA"/>
+                  <w:tcMar>
+                    <w:top w:w="60" w:type="dxa"/>
+                    <w:left w:w="80" w:type="dxa"/>
+                    <w:bottom w:w="60" w:type="dxa"/>
+                    <w:right w:w="80" w:type="dxa"/>
+                  </w:tcMar>
+                </w:tcPr>
+                <w:p>
+                  <w:pPr>
+                    <w:jc w:val="center"/>
+                  </w:pPr>
+                  <w:r>
+                    <w:rPr>
+                      <w:rFonts w:ascii="Aptos" w:eastAsia="Aptos" w:hAnsi="Aptos" w:cs="Aptos"/>
+                      <w:b/>
+                      <w:bCs/>
+                      <w:color w:val="4A453D"/>
+                      <w:sz w:val="18"/>
+                      <w:szCs w:val="18"/>
+                    </w:rPr>
+                    <w:t>Volume</w:t>
+                  </w:r>
+                </w:p>
+              </w:tc>
+              <w:tc>
+                <w:tcPr>
+                  <w:tcW w:w="800" w:type="dxa"/>
+                  <w:shd w:val="clear" w:color="auto" w:fill="FFFFFF"/>
+                  <w:tcMar>
+                    <w:top w:w="60" w:type="dxa"/>
+                    <w:left w:w="80" w:type="dxa"/>
+                    <w:bottom w:w="60" w:type="dxa"/>
+                    <w:right w:w="80" w:type="dxa"/>
+                  </w:tcMar>
+                </w:tcPr>
+                <w:p>
+                  <w:pPr>
+                    <w:jc w:val="center"/>
+                  </w:pPr>
+                </w:p>
+              </w:tc>
+              <w:tc>
+                <w:tcPr>
+                  <w:tcW w:w="800" w:type="dxa"/>
+                  <w:shd w:val="clear" w:color="auto" w:fill="FFFFFF"/>
+                  <w:tcMar>
+                    <w:top w:w="60" w:type="dxa"/>
+                    <w:left w:w="80" w:type="dxa"/>
+                    <w:bottom w:w="60" w:type="dxa"/>
+                    <w:right w:w="80" w:type="dxa"/>
+                  </w:tcMar>
+                </w:tcPr>
+                <w:p>
+                  <w:pPr>
+                    <w:jc w:val="center"/>
+                  </w:pPr>
+                </w:p>
+              </w:tc>
+              <w:tc>
+                <w:tcPr>
+                  <w:tcW w:w="800" w:type="dxa"/>
+                  <w:shd w:val="clear" w:color="auto" w:fill="FFFFFF"/>
+                  <w:tcMar>
+                    <w:top w:w="60" w:type="dxa"/>
+                    <w:left w:w="80" w:type="dxa"/>
+                    <w:bottom w:w="60" w:type="dxa"/>
+                    <w:right w:w="80" w:type="dxa"/>
+                  </w:tcMar>
+                </w:tcPr>
+                <w:p>
+                  <w:pPr>
+                    <w:jc w:val="center"/>
+                  </w:pPr>
+                </w:p>
+              </w:tc>
+              <w:tc>
+                <w:tcPr>
+                  <w:tcW w:w="800" w:type="dxa"/>
+                  <w:shd w:val="clear" w:color="auto" w:fill="FFFFFF"/>
+                  <w:tcMar>
+                    <w:top w:w="60" w:type="dxa"/>
+                    <w:left w:w="80" w:type="dxa"/>
+                    <w:bottom w:w="60" w:type="dxa"/>
+                    <w:right w:w="80" w:type="dxa"/>
+                  </w:tcMar>
+                </w:tcPr>
+                <w:p>
+                  <w:pPr>
+                    <w:jc w:val="center"/>
+                  </w:pPr>
+                </w:p>
+              </w:tc>
+              <w:tc>
+                <w:tcPr>
+                  <w:tcW w:w="800" w:type="dxa"/>
+                  <w:shd w:val="clear" w:color="auto" w:fill="FFFFFF"/>
+                  <w:tcMar>
+                    <w:top w:w="60" w:type="dxa"/>
+                    <w:left w:w="80" w:type="dxa"/>
+                    <w:bottom w:w="60" w:type="dxa"/>
+                    <w:right w:w="80" w:type="dxa"/>
+                  </w:tcMar>
+                </w:tcPr>
+                <w:p>
+                  <w:pPr>
+                    <w:jc w:val="center"/>
+                  </w:pPr>
+                </w:p>
+              </w:tc>
+              <w:tc>
+                <w:tcPr>
+                  <w:tcW w:w="800" w:type="dxa"/>
+                  <w:shd w:val="clear" w:color="auto" w:fill="FFFFFF"/>
+                  <w:tcMar>
+                    <w:top w:w="60" w:type="dxa"/>
+                    <w:left w:w="80" w:type="dxa"/>
+                    <w:bottom w:w="60" w:type="dxa"/>
+                    <w:right w:w="80" w:type="dxa"/>
+                  </w:tcMar>
+                </w:tcPr>
+                <w:p>
+                  <w:pPr>
+                    <w:jc w:val="center"/>
+                  </w:pPr>
+                </w:p>
+              </w:tc>
+            </w:tr>
+          </w:tbl>
         </w:tc>
       </w:tr>
       <w:tr>

</xml_diff>